<commit_message>
feat(ui): adiciona componente Swiper carousel com efeito coverflow 3D
</commit_message>
<xml_diff>
--- a/src/reports/relatorio_11.docx
+++ b/src/reports/relatorio_11.docx
@@ -5523,6 +5523,7 @@
                 <w:rFonts w:ascii="Aptos" w:hAnsi="Aptos"/>
                 <w:sz w:val="20"/>
               </w:rPr>
+              <w:t>Infiltração na coluna de sustentação da estrutura metálica da área de embarque e desembarque do Terminal do Recife (TIP), conforme evidenciado nas fotos 01 e 02, a seguir!!!!!!!</w:t>
             </w:r>
           </w:p>
         </w:tc>
@@ -5647,6 +5648,7 @@
                 <w:rFonts w:ascii="Aptos" w:hAnsi="Aptos"/>
                 <w:sz w:val="20"/>
               </w:rPr>
+              <w:t>Falta de manutenção adequada no banheiro feminino para PCD localizado no primeiro andar do Terminal do Recife (TIP), conforme detalhado.</w:t>
             </w:r>
           </w:p>
         </w:tc>
@@ -5771,6 +5773,7 @@
                 <w:rFonts w:ascii="Aptos" w:hAnsi="Aptos"/>
                 <w:sz w:val="20"/>
               </w:rPr>
+              <w:t xml:space="preserve">Espelho oxidado, conforme evidenciado na foto 03, a seguir. </w:t>
             </w:r>
           </w:p>
         </w:tc>
@@ -5895,6 +5898,7 @@
                 <w:rFonts w:ascii="Aptos" w:hAnsi="Aptos"/>
                 <w:sz w:val="20"/>
               </w:rPr>
+              <w:t xml:space="preserve">Barra oxidada em torno da pian cofnorme foto 01 e foto 02. </w:t>
             </w:r>
           </w:p>
         </w:tc>
@@ -6019,6 +6023,7 @@
                 <w:rFonts w:ascii="Aptos" w:hAnsi="Aptos"/>
                 <w:sz w:val="20"/>
               </w:rPr>
+              <w:t xml:space="preserve">Barra de apoio vertical oxidada, conforme foto 04, a seguir. </w:t>
             </w:r>
           </w:p>
         </w:tc>
@@ -6143,6 +6148,7 @@
                 <w:rFonts w:ascii="Aptos" w:hAnsi="Aptos"/>
                 <w:sz w:val="20"/>
               </w:rPr>
+              <w:t>Piso desgastado na entrada do banheiro feminino do TIP em 20/03/2025;</w:t>
             </w:r>
           </w:p>
         </w:tc>

</xml_diff>